<commit_message>
Remove overlap between AI vs human article and related posts; align H2s with search queries
Co-Authored-By: Claude Opus 5.5 <noreply@anthropic.com>
Claude-Session: https://claude.ai/code/session_01GQXcnZLn4f9MkUS7SEqp5J
</commit_message>
<xml_diff>
--- a/blog-content/AI-Blog-Writer-vs-Human-Writer-FINAL.docx
+++ b/blog-content/AI-Blog-Writer-vs-Human-Writer-FINAL.docx
@@ -167,7 +167,7 @@
         </w:rPr>
         <w:t xml:space="preserve">This comparison sets out what each approach delivers, what the ranking data says, what each costs in 2026 and when to use which. It's part of our </w:t>
       </w:r>
-      <w:hyperlink w:history="1" r:id="rIdhz037ndlpaeuqlc4hvux7">
+      <w:hyperlink w:history="1" r:id="rIdt2q1mz0iyp7mdd_i9ljne">
         <w:r>
           <w:rPr>
             <w:rStyle w:val="Hyperlink"/>
@@ -218,7 +218,29 @@
           <w:sz w:val="24"/>
           <w:szCs w:val="24"/>
         </w:rPr>
-        <w:t xml:space="preserve">At the very top of the results, yes, but the gap mostly disappears once AI drafts are properly edited. What Google penalises is low-value content, not the tool behind it.</w:t>
+        <w:t xml:space="preserve">At the very top of the results, yes, but the gap mostly disappears once AI drafts are properly edited. What Google penalises is low-value content, not the tool behind it. Whether Google can spot AI text at all is a separate question, covered in </w:t>
+      </w:r>
+      <w:hyperlink w:history="1" r:id="rId_3l_sz0_lpywhh1ydshth">
+        <w:r>
+          <w:rPr>
+            <w:rStyle w:val="Hyperlink"/>
+            <w:rFonts w:ascii="Calibri" w:cs="Calibri" w:eastAsia="Calibri" w:hAnsi="Calibri"/>
+            <w:color w:val="0563C1"/>
+            <w:sz w:val="24"/>
+            <w:szCs w:val="24"/>
+            <w:u w:val="single"/>
+          </w:rPr>
+          <w:t xml:space="preserve">can Google detect AI content</w:t>
+        </w:r>
+      </w:hyperlink>
+      <w:r>
+        <w:rPr>
+          <w:rFonts w:ascii="Calibri" w:cs="Calibri" w:eastAsia="Calibri" w:hAnsi="Calibri"/>
+          <w:color w:val="333333"/>
+          <w:sz w:val="24"/>
+          <w:szCs w:val="24"/>
+        </w:rPr>
+        <w:t xml:space="preserve">.</w:t>
       </w:r>
     </w:p>
     <w:p>
@@ -263,7 +285,7 @@
         </w:rPr>
         <w:t xml:space="preserve"> Semrush analysed </w:t>
       </w:r>
-      <w:hyperlink w:history="1" r:id="rIdwvegeoeilf6x__blyjgbx">
+      <w:hyperlink w:history="1" r:id="rIdves8hgu1isggjjagauwyu">
         <w:r>
           <w:rPr>
             <w:rStyle w:val="Hyperlink"/>
@@ -314,7 +336,7 @@
         </w:rPr>
         <w:t xml:space="preserve"> Digital Applied tracked </w:t>
       </w:r>
-      <w:hyperlink w:history="1" r:id="rIde_ryscozjgkzplwgubwd5">
+      <w:hyperlink w:history="1" r:id="rIdvitdln233siijmloff-fs">
         <w:r>
           <w:rPr>
             <w:rStyle w:val="Hyperlink"/>
@@ -365,7 +387,7 @@
         </w:rPr>
         <w:t xml:space="preserve"> In a </w:t>
       </w:r>
-      <w:hyperlink w:history="1" r:id="rIdvxikhybgn7jmkvcqjnmhd">
+      <w:hyperlink w:history="1" r:id="rId4apmxcnlmbfghsvkcry38">
         <w:r>
           <w:rPr>
             <w:rStyle w:val="Hyperlink"/>
@@ -416,7 +438,7 @@
         </w:rPr>
         <w:t xml:space="preserve"> Ahrefs checked </w:t>
       </w:r>
-      <w:hyperlink w:history="1" r:id="rIdf5hgvdc46iak6eforz_cq">
+      <w:hyperlink w:history="1" r:id="rIdpsroy2jhcjooeohdr6q-0">
         <w:r>
           <w:rPr>
             <w:rStyle w:val="Hyperlink"/>
@@ -525,7 +547,7 @@
           <w:sz w:val="36"/>
           <w:szCs w:val="36"/>
         </w:rPr>
-        <w:t xml:space="preserve">Can readers tell AI writing from human writing?</w:t>
+        <w:t xml:space="preserve">Can AI write like a human, and can readers tell?</w:t>
       </w:r>
     </w:p>
     <w:p>
@@ -541,7 +563,7 @@
         </w:rPr>
         <w:t xml:space="preserve">Often they can't, and in one large test they preferred the AI. In March 2026 The New York Times ran a blind quiz in which </w:t>
       </w:r>
-      <w:hyperlink w:history="1" r:id="rIdzoeek-l8nvw7b7kyrp5-i">
+      <w:hyperlink w:history="1" r:id="rIdxcun0_3nteo-b6v22irhk">
         <w:r>
           <w:rPr>
             <w:rStyle w:val="Hyperlink"/>
@@ -606,7 +628,7 @@
           <w:sz w:val="36"/>
           <w:szCs w:val="36"/>
         </w:rPr>
-        <w:t xml:space="preserve">How do AI and human writers compare?</w:t>
+        <w:t xml:space="preserve">Is AI writing better than human writing? Pros and cons</w:t>
       </w:r>
     </w:p>
     <w:p>
@@ -1123,7 +1145,7 @@
         </w:rPr>
         <w:t xml:space="preserve">Google's guide to </w:t>
       </w:r>
-      <w:hyperlink w:history="1" r:id="rIdvi8bksvryr02lgrjn56u0">
+      <w:hyperlink w:history="1" r:id="rId7bs6rwgowxweaox7ufckb">
         <w:r>
           <w:rPr>
             <w:rStyle w:val="Hyperlink"/>
@@ -1145,7 +1167,7 @@
         </w:rPr>
         <w:t xml:space="preserve"> asks directly whether a page provides "original information, reporting, research, or analysis". Spun content fails that question whoever wrote it. Rewording and genuine rewriting are different jobs; </w:t>
       </w:r>
-      <w:hyperlink w:history="1" r:id="rIdw7erbsv2mwczwvs_umkwf">
+      <w:hyperlink w:history="1" r:id="rIdvggwxzb2lvtcyttfn-8la">
         <w:r>
           <w:rPr>
             <w:rStyle w:val="Hyperlink"/>
@@ -1181,7 +1203,7 @@
         </w:rPr>
         <w:t xml:space="preserve">Good human writers still exist. Specialists who interview sources and write from real knowledge produce work AI can't match, but they charge accordingly: senior and specialist writers typically quote </w:t>
       </w:r>
-      <w:hyperlink w:history="1" r:id="rIdfl2-8ayh4hcnsu2so9jb_">
+      <w:hyperlink w:history="1" r:id="rIdvgdopx_a3ohlopukeybnl">
         <w:r>
           <w:rPr>
             <w:rStyle w:val="Hyperlink"/>
@@ -1542,7 +1564,7 @@
         </w:rPr>
         <w:t xml:space="preserve">The articles work because of the research and the editing, not because AI wrote the words. The full step-by-step method is in </w:t>
       </w:r>
-      <w:hyperlink w:history="1" r:id="rIdovaacoocgssyqe6kl--0q">
+      <w:hyperlink w:history="1" r:id="rIdm0oasfa8u94kb_vsd0xj9">
         <w:r>
           <w:rPr>
             <w:rStyle w:val="Hyperlink"/>
@@ -2045,7 +2067,7 @@
         </w:rPr>
         <w:t xml:space="preserve">*Freelance ranges: </w:t>
       </w:r>
-      <w:hyperlink w:history="1" r:id="rIdhvbd-aghroom_qxe1acqi">
+      <w:hyperlink w:history="1" r:id="rIdqz248qbr7saimvqcfad8g">
         <w:r>
           <w:rPr>
             <w:rStyle w:val="Hyperlink"/>
@@ -2081,7 +2103,7 @@
         </w:rPr>
         <w:t xml:space="preserve">The hidden cost is revisions. A cheap draft that needs rewriting costs you the same hours as editing an AI draft, plus the fee. With AI you control the inputs from the start: the research, the brief and the structure. The editing steps are in </w:t>
       </w:r>
-      <w:hyperlink w:history="1" r:id="rIdzehaciwf-p9yqqluce8dv">
+      <w:hyperlink w:history="1" r:id="rId5qt2-mrir4x_k0oqbwgim">
         <w:r>
           <w:rPr>
             <w:rStyle w:val="Hyperlink"/>
@@ -2103,7 +2125,7 @@
         </w:rPr>
         <w:t xml:space="preserve">, and our free </w:t>
       </w:r>
-      <w:hyperlink w:history="1" r:id="rIdjgn8j9d8plmg4kgyazvm7">
+      <w:hyperlink w:history="1" r:id="rIdfxnrtqonzf8-ub_tv8ihh">
         <w:r>
           <w:rPr>
             <w:rStyle w:val="Hyperlink"/>
@@ -2140,7 +2162,7 @@
           <w:sz w:val="36"/>
           <w:szCs w:val="36"/>
         </w:rPr>
-        <w:t xml:space="preserve">When should you choose AI, a human writer, or both?</w:t>
+        <w:t xml:space="preserve">Should you use AI or hire a writer?</w:t>
       </w:r>
     </w:p>
     <w:p>
@@ -2240,7 +2262,7 @@
           <w:sz w:val="24"/>
           <w:szCs w:val="24"/>
         </w:rPr>
-        <w:t xml:space="preserve">Hire a human writer when:</w:t>
+        <w:t xml:space="preserve">Hire a human writer or copywriter when:</w:t>
       </w:r>
     </w:p>
     <w:p>
@@ -2362,7 +2384,7 @@
         </w:rPr>
         <w:t xml:space="preserve">For tools to start with, see </w:t>
       </w:r>
-      <w:hyperlink w:history="1" r:id="rIdoevhdw6cjccj_-txcuocb">
+      <w:hyperlink w:history="1" r:id="rId_kkmx6jjegkkmbak7y3k7">
         <w:r>
           <w:rPr>
             <w:rStyle w:val="Hyperlink"/>
@@ -2413,29 +2435,7 @@
           <w:sz w:val="24"/>
           <w:szCs w:val="24"/>
         </w:rPr>
-        <w:t xml:space="preserve">It's replacing the work, not the writers who adapt. Orbit Media's 2026 survey of 1,042 content marketers found that </w:t>
-      </w:r>
-      <w:hyperlink w:history="1" r:id="rId-prunan4dv6kamz41ggch">
-        <w:r>
-          <w:rPr>
-            <w:rStyle w:val="Hyperlink"/>
-            <w:rFonts w:ascii="Calibri" w:cs="Calibri" w:eastAsia="Calibri" w:hAnsi="Calibri"/>
-            <w:color w:val="0563C1"/>
-            <w:sz w:val="24"/>
-            <w:szCs w:val="24"/>
-            <w:u w:val="single"/>
-          </w:rPr>
-          <w:t xml:space="preserve">92.4% use AI for blogging</w:t>
-        </w:r>
-      </w:hyperlink>
-      <w:r>
-        <w:rPr>
-          <w:rFonts w:ascii="Calibri" w:cs="Calibri" w:eastAsia="Calibri" w:hAnsi="Calibri"/>
-          <w:color w:val="333333"/>
-          <w:sz w:val="24"/>
-          <w:szCs w:val="24"/>
-        </w:rPr>
-        <w:t xml:space="preserve">, but only 17% use it to write complete drafts. Most writers use it for parts of the job.</w:t>
+        <w:t xml:space="preserve">It's replacing parts of the work, not the writers who adapt. Most content teams already use AI for research, outlines and first drafts, and still pay people for the parts that need judgement.</w:t>
       </w:r>
     </w:p>
     <w:p>
@@ -2561,7 +2561,7 @@
         </w:rPr>
         <w:t xml:space="preserve">Not reliably. Detectors guess from writing patterns, flag some human writing, and miss AI text that's been edited. Use one as a prompt for a conversation, not as proof. A better check is to ask for the writer's sources and notes. Our free </w:t>
       </w:r>
-      <w:hyperlink w:history="1" r:id="rIdkxgad7b6c4q3ykuaz6nws">
+      <w:hyperlink w:history="1" r:id="rIdenxixqtw72h5x4h5bfuew">
         <w:r>
           <w:rPr>
             <w:rStyle w:val="Hyperlink"/>
@@ -2673,7 +2673,7 @@
         </w:rPr>
         <w:t xml:space="preserve">See what a structured first draft looks like with our free </w:t>
       </w:r>
-      <w:hyperlink w:history="1" r:id="rId5lvsoptgfoe3h5gtlk0dy">
+      <w:hyperlink w:history="1" r:id="rId-m_tu0cgtmj9ja6s_l5az">
         <w:r>
           <w:rPr>
             <w:rStyle w:val="Hyperlink"/>
@@ -2695,7 +2695,7 @@
         </w:rPr>
         <w:t xml:space="preserve">, then follow the </w:t>
       </w:r>
-      <w:hyperlink w:history="1" r:id="rIdo4t1mzc9stbmkaiznli0k">
+      <w:hyperlink w:history="1" r:id="rId3qbpzd__ahxi32zscumup">
         <w:r>
           <w:rPr>
             <w:rStyle w:val="Hyperlink"/>

</xml_diff>